<commit_message>
Document Go backend architecture
</commit_message>
<xml_diff>
--- a/CRM-Architecture-Vision-MVP.docx
+++ b/CRM-Architecture-Vision-MVP.docx
@@ -40,7 +40,7 @@
           <w:color w:val="5F6B7A"/>
           <w:sz w:val="28"/>
         </w:rPr>
-        <w:t>Rancangan MVP untuk integrasi dengan platform AI pendidikan dan billing yang sudah ada</w:t>
+        <w:t>Rancangan MVP berbasis Go untuk integrasi dengan platform AI pendidikan dan billing yang sudah ada</w:t>
       </w:r>
     </w:p>
     <w:tbl>
@@ -300,6 +300,58 @@
                 <w:color w:val="000000"/>
                 <w:sz w:val="19"/>
               </w:rPr>
+              <w:t>Backend</w:t>
+            </w:r>
+          </w:p>
+        </w:tc>
+        <w:tc>
+          <w:tcPr>
+            <w:tcW w:type="dxa" w:w="7160"/>
+            <w:tcMar>
+              <w:top w:w="80" w:type="dxa"/>
+              <w:start w:w="120" w:type="dxa"/>
+              <w:bottom w:w="80" w:type="dxa"/>
+              <w:end w:w="120" w:type="dxa"/>
+            </w:tcMar>
+            <w:vAlign w:val="center"/>
+          </w:tcPr>
+          <w:p>
+            <w:pPr>
+              <w:spacing w:after="0"/>
+            </w:pPr>
+            <w:r>
+              <w:rPr>
+                <w:rFonts w:ascii="Calibri" w:hAnsi="Calibri"/>
+                <w:color w:val="000000"/>
+                <w:sz w:val="19"/>
+              </w:rPr>
+              <w:t>Go modular monolith: crm-api + crm-worker + PostgreSQL</w:t>
+            </w:r>
+          </w:p>
+        </w:tc>
+      </w:tr>
+      <w:tr>
+        <w:tc>
+          <w:tcPr>
+            <w:tcW w:type="dxa" w:w="2200"/>
+            <w:tcMar>
+              <w:top w:w="80" w:type="dxa"/>
+              <w:start w:w="120" w:type="dxa"/>
+              <w:bottom w:w="80" w:type="dxa"/>
+              <w:end w:w="120" w:type="dxa"/>
+            </w:tcMar>
+            <w:vAlign w:val="center"/>
+          </w:tcPr>
+          <w:p>
+            <w:pPr>
+              <w:spacing w:after="0"/>
+            </w:pPr>
+            <w:r>
+              <w:rPr>
+                <w:rFonts w:ascii="Calibri" w:hAnsi="Calibri"/>
+                <w:color w:val="000000"/>
+                <w:sz w:val="19"/>
+              </w:rPr>
               <w:t>Version</w:t>
             </w:r>
           </w:p>
@@ -325,7 +377,7 @@
                 <w:color w:val="000000"/>
                 <w:sz w:val="19"/>
               </w:rPr>
-              <w:t>0.1 - 1 September 2026</w:t>
+              <w:t>0.2 - 1 September 2026</w:t>
             </w:r>
           </w:p>
         </w:tc>
@@ -1761,7 +1813,7 @@
           <w:color w:val="000000"/>
           <w:sz w:val="22"/>
         </w:rPr>
-        <w:t>Mulai dengan CRM modular monolith, database CRM, dan integration worker.</w:t>
+        <w:t>Mulai dengan Go modular monolith, PostgreSQL CRM, serta process crm-api dan crm-worker.</w:t>
       </w:r>
     </w:p>
     <w:p>
@@ -1796,6 +1848,608 @@
           <w:sz w:val="22"/>
         </w:rPr>
         <w:t>Tambahkan event bus terkelola dan reporting read model saat volume dan consumer bertambah.</w:t>
+      </w:r>
+    </w:p>
+    <w:p>
+      <w:pPr>
+        <w:pStyle w:val="Heading2"/>
+        <w:keepNext/>
+      </w:pPr>
+      <w:r>
+        <w:t>2.3 Go implementation baseline</w:t>
+      </w:r>
+    </w:p>
+    <w:tbl>
+      <w:tblPr>
+        <w:tblW w:type="dxa" w:w="9360"/>
+        <w:tblLayout w:type="fixed"/>
+        <w:tblLook w:firstColumn="1" w:firstRow="1" w:lastColumn="0" w:lastRow="0" w:noHBand="0" w:noVBand="1" w:val="04A0"/>
+        <w:jc w:val="left"/>
+        <w:tblInd w:w="120" w:type="dxa"/>
+        <w:tblBorders>
+          <w:top w:val="single" w:sz="6" w:space="0" w:color="D9DEE7"/>
+          <w:left w:val="single" w:sz="6" w:space="0" w:color="D9DEE7"/>
+          <w:bottom w:val="single" w:sz="6" w:space="0" w:color="D9DEE7"/>
+          <w:right w:val="single" w:sz="6" w:space="0" w:color="D9DEE7"/>
+          <w:insideH w:val="single" w:sz="6" w:space="0" w:color="D9DEE7"/>
+          <w:insideV w:val="single" w:sz="6" w:space="0" w:color="D9DEE7"/>
+        </w:tblBorders>
+      </w:tblPr>
+      <w:tblGrid>
+        <w:gridCol w:w="1700"/>
+        <w:gridCol w:w="2600"/>
+        <w:gridCol w:w="5060"/>
+      </w:tblGrid>
+      <w:tr>
+        <w:trPr>
+          <w:tblHeader w:val="true"/>
+        </w:trPr>
+        <w:tc>
+          <w:tcPr>
+            <w:tcW w:type="dxa" w:w="1700"/>
+            <w:tcMar>
+              <w:top w:w="80" w:type="dxa"/>
+              <w:start w:w="120" w:type="dxa"/>
+              <w:bottom w:w="80" w:type="dxa"/>
+              <w:end w:w="120" w:type="dxa"/>
+            </w:tcMar>
+            <w:vAlign w:val="center"/>
+            <w:shd w:fill="F2F4F7"/>
+          </w:tcPr>
+          <w:p>
+            <w:pPr>
+              <w:spacing w:after="0"/>
+            </w:pPr>
+            <w:r>
+              <w:rPr>
+                <w:rFonts w:ascii="Calibri" w:hAnsi="Calibri"/>
+                <w:b/>
+                <w:color w:val="172B4D"/>
+                <w:sz w:val="19"/>
+              </w:rPr>
+              <w:t>Layer</w:t>
+            </w:r>
+          </w:p>
+        </w:tc>
+        <w:tc>
+          <w:tcPr>
+            <w:tcW w:type="dxa" w:w="2600"/>
+            <w:tcMar>
+              <w:top w:w="80" w:type="dxa"/>
+              <w:start w:w="120" w:type="dxa"/>
+              <w:bottom w:w="80" w:type="dxa"/>
+              <w:end w:w="120" w:type="dxa"/>
+            </w:tcMar>
+            <w:vAlign w:val="center"/>
+            <w:shd w:fill="F2F4F7"/>
+          </w:tcPr>
+          <w:p>
+            <w:pPr>
+              <w:spacing w:after="0"/>
+            </w:pPr>
+            <w:r>
+              <w:rPr>
+                <w:rFonts w:ascii="Calibri" w:hAnsi="Calibri"/>
+                <w:b/>
+                <w:color w:val="172B4D"/>
+                <w:sz w:val="19"/>
+              </w:rPr>
+              <w:t>Go baseline</w:t>
+            </w:r>
+          </w:p>
+        </w:tc>
+        <w:tc>
+          <w:tcPr>
+            <w:tcW w:type="dxa" w:w="5060"/>
+            <w:tcMar>
+              <w:top w:w="80" w:type="dxa"/>
+              <w:start w:w="120" w:type="dxa"/>
+              <w:bottom w:w="80" w:type="dxa"/>
+              <w:end w:w="120" w:type="dxa"/>
+            </w:tcMar>
+            <w:vAlign w:val="center"/>
+            <w:shd w:fill="F2F4F7"/>
+          </w:tcPr>
+          <w:p>
+            <w:pPr>
+              <w:spacing w:after="0"/>
+            </w:pPr>
+            <w:r>
+              <w:rPr>
+                <w:rFonts w:ascii="Calibri" w:hAnsi="Calibri"/>
+                <w:b/>
+                <w:color w:val="172B4D"/>
+                <w:sz w:val="19"/>
+              </w:rPr>
+              <w:t>Responsibility</w:t>
+            </w:r>
+          </w:p>
+        </w:tc>
+      </w:tr>
+      <w:tr>
+        <w:tc>
+          <w:tcPr>
+            <w:tcW w:type="dxa" w:w="1700"/>
+            <w:tcMar>
+              <w:top w:w="80" w:type="dxa"/>
+              <w:start w:w="120" w:type="dxa"/>
+              <w:bottom w:w="80" w:type="dxa"/>
+              <w:end w:w="120" w:type="dxa"/>
+            </w:tcMar>
+            <w:vAlign w:val="center"/>
+          </w:tcPr>
+          <w:p>
+            <w:pPr>
+              <w:spacing w:after="0"/>
+            </w:pPr>
+            <w:r>
+              <w:rPr>
+                <w:rFonts w:ascii="Calibri" w:hAnsi="Calibri"/>
+                <w:color w:val="000000"/>
+                <w:sz w:val="19"/>
+              </w:rPr>
+              <w:t>Process</w:t>
+            </w:r>
+          </w:p>
+        </w:tc>
+        <w:tc>
+          <w:tcPr>
+            <w:tcW w:type="dxa" w:w="2600"/>
+            <w:tcMar>
+              <w:top w:w="80" w:type="dxa"/>
+              <w:start w:w="120" w:type="dxa"/>
+              <w:bottom w:w="80" w:type="dxa"/>
+              <w:end w:w="120" w:type="dxa"/>
+            </w:tcMar>
+            <w:vAlign w:val="center"/>
+          </w:tcPr>
+          <w:p>
+            <w:pPr>
+              <w:spacing w:after="0"/>
+            </w:pPr>
+            <w:r>
+              <w:rPr>
+                <w:rFonts w:ascii="Calibri" w:hAnsi="Calibri"/>
+                <w:color w:val="000000"/>
+                <w:sz w:val="19"/>
+              </w:rPr>
+              <w:t>cmd/crm-api</w:t>
+            </w:r>
+          </w:p>
+        </w:tc>
+        <w:tc>
+          <w:tcPr>
+            <w:tcW w:type="dxa" w:w="5060"/>
+            <w:tcMar>
+              <w:top w:w="80" w:type="dxa"/>
+              <w:start w:w="120" w:type="dxa"/>
+              <w:bottom w:w="80" w:type="dxa"/>
+              <w:end w:w="120" w:type="dxa"/>
+            </w:tcMar>
+            <w:vAlign w:val="center"/>
+          </w:tcPr>
+          <w:p>
+            <w:pPr>
+              <w:spacing w:after="0"/>
+            </w:pPr>
+            <w:r>
+              <w:rPr>
+                <w:rFonts w:ascii="Calibri" w:hAnsi="Calibri"/>
+                <w:color w:val="000000"/>
+                <w:sz w:val="19"/>
+              </w:rPr>
+              <w:t>REST API, public booking, internal UI API, webhook receiver</w:t>
+            </w:r>
+          </w:p>
+        </w:tc>
+      </w:tr>
+      <w:tr>
+        <w:tc>
+          <w:tcPr>
+            <w:tcW w:type="dxa" w:w="1700"/>
+            <w:tcMar>
+              <w:top w:w="80" w:type="dxa"/>
+              <w:start w:w="120" w:type="dxa"/>
+              <w:bottom w:w="80" w:type="dxa"/>
+              <w:end w:w="120" w:type="dxa"/>
+            </w:tcMar>
+            <w:vAlign w:val="center"/>
+          </w:tcPr>
+          <w:p>
+            <w:pPr>
+              <w:spacing w:after="0"/>
+            </w:pPr>
+            <w:r>
+              <w:rPr>
+                <w:rFonts w:ascii="Calibri" w:hAnsi="Calibri"/>
+                <w:color w:val="000000"/>
+                <w:sz w:val="19"/>
+              </w:rPr>
+              <w:t>Process</w:t>
+            </w:r>
+          </w:p>
+        </w:tc>
+        <w:tc>
+          <w:tcPr>
+            <w:tcW w:type="dxa" w:w="2600"/>
+            <w:tcMar>
+              <w:top w:w="80" w:type="dxa"/>
+              <w:start w:w="120" w:type="dxa"/>
+              <w:bottom w:w="80" w:type="dxa"/>
+              <w:end w:w="120" w:type="dxa"/>
+            </w:tcMar>
+            <w:vAlign w:val="center"/>
+          </w:tcPr>
+          <w:p>
+            <w:pPr>
+              <w:spacing w:after="0"/>
+            </w:pPr>
+            <w:r>
+              <w:rPr>
+                <w:rFonts w:ascii="Calibri" w:hAnsi="Calibri"/>
+                <w:color w:val="000000"/>
+                <w:sz w:val="19"/>
+              </w:rPr>
+              <w:t>cmd/crm-worker</w:t>
+            </w:r>
+          </w:p>
+        </w:tc>
+        <w:tc>
+          <w:tcPr>
+            <w:tcW w:type="dxa" w:w="5060"/>
+            <w:tcMar>
+              <w:top w:w="80" w:type="dxa"/>
+              <w:start w:w="120" w:type="dxa"/>
+              <w:bottom w:w="80" w:type="dxa"/>
+              <w:end w:w="120" w:type="dxa"/>
+            </w:tcMar>
+            <w:vAlign w:val="center"/>
+          </w:tcPr>
+          <w:p>
+            <w:pPr>
+              <w:spacing w:after="0"/>
+            </w:pPr>
+            <w:r>
+              <w:rPr>
+                <w:rFonts w:ascii="Calibri" w:hAnsi="Calibri"/>
+                <w:color w:val="000000"/>
+                <w:sz w:val="19"/>
+              </w:rPr>
+              <w:t>Reminder, expiry, outbox delivery, inbox processing, reconciliation</w:t>
+            </w:r>
+          </w:p>
+        </w:tc>
+      </w:tr>
+      <w:tr>
+        <w:tc>
+          <w:tcPr>
+            <w:tcW w:type="dxa" w:w="1700"/>
+            <w:tcMar>
+              <w:top w:w="80" w:type="dxa"/>
+              <w:start w:w="120" w:type="dxa"/>
+              <w:bottom w:w="80" w:type="dxa"/>
+              <w:end w:w="120" w:type="dxa"/>
+            </w:tcMar>
+            <w:vAlign w:val="center"/>
+          </w:tcPr>
+          <w:p>
+            <w:pPr>
+              <w:spacing w:after="0"/>
+            </w:pPr>
+            <w:r>
+              <w:rPr>
+                <w:rFonts w:ascii="Calibri" w:hAnsi="Calibri"/>
+                <w:color w:val="000000"/>
+                <w:sz w:val="19"/>
+              </w:rPr>
+              <w:t>Domain</w:t>
+            </w:r>
+          </w:p>
+        </w:tc>
+        <w:tc>
+          <w:tcPr>
+            <w:tcW w:type="dxa" w:w="2600"/>
+            <w:tcMar>
+              <w:top w:w="80" w:type="dxa"/>
+              <w:start w:w="120" w:type="dxa"/>
+              <w:bottom w:w="80" w:type="dxa"/>
+              <w:end w:w="120" w:type="dxa"/>
+            </w:tcMar>
+            <w:vAlign w:val="center"/>
+          </w:tcPr>
+          <w:p>
+            <w:pPr>
+              <w:spacing w:after="0"/>
+            </w:pPr>
+            <w:r>
+              <w:rPr>
+                <w:rFonts w:ascii="Calibri" w:hAnsi="Calibri"/>
+                <w:color w:val="000000"/>
+                <w:sz w:val="19"/>
+              </w:rPr>
+              <w:t>internal/&lt;domain&gt;</w:t>
+            </w:r>
+          </w:p>
+        </w:tc>
+        <w:tc>
+          <w:tcPr>
+            <w:tcW w:type="dxa" w:w="5060"/>
+            <w:tcMar>
+              <w:top w:w="80" w:type="dxa"/>
+              <w:start w:w="120" w:type="dxa"/>
+              <w:bottom w:w="80" w:type="dxa"/>
+              <w:end w:w="120" w:type="dxa"/>
+            </w:tcMar>
+            <w:vAlign w:val="center"/>
+          </w:tcPr>
+          <w:p>
+            <w:pPr>
+              <w:spacing w:after="0"/>
+            </w:pPr>
+            <w:r>
+              <w:rPr>
+                <w:rFonts w:ascii="Calibri" w:hAnsi="Calibri"/>
+                <w:color w:val="000000"/>
+                <w:sz w:val="19"/>
+              </w:rPr>
+              <w:t>Lead, webinar, campaign, voucher, opportunity, commission rules</w:t>
+            </w:r>
+          </w:p>
+        </w:tc>
+      </w:tr>
+      <w:tr>
+        <w:tc>
+          <w:tcPr>
+            <w:tcW w:type="dxa" w:w="1700"/>
+            <w:tcMar>
+              <w:top w:w="80" w:type="dxa"/>
+              <w:start w:w="120" w:type="dxa"/>
+              <w:bottom w:w="80" w:type="dxa"/>
+              <w:end w:w="120" w:type="dxa"/>
+            </w:tcMar>
+            <w:vAlign w:val="center"/>
+          </w:tcPr>
+          <w:p>
+            <w:pPr>
+              <w:spacing w:after="0"/>
+            </w:pPr>
+            <w:r>
+              <w:rPr>
+                <w:rFonts w:ascii="Calibri" w:hAnsi="Calibri"/>
+                <w:color w:val="000000"/>
+                <w:sz w:val="19"/>
+              </w:rPr>
+              <w:t>Adapter</w:t>
+            </w:r>
+          </w:p>
+        </w:tc>
+        <w:tc>
+          <w:tcPr>
+            <w:tcW w:type="dxa" w:w="2600"/>
+            <w:tcMar>
+              <w:top w:w="80" w:type="dxa"/>
+              <w:start w:w="120" w:type="dxa"/>
+              <w:bottom w:w="80" w:type="dxa"/>
+              <w:end w:w="120" w:type="dxa"/>
+            </w:tcMar>
+            <w:vAlign w:val="center"/>
+          </w:tcPr>
+          <w:p>
+            <w:pPr>
+              <w:spacing w:after="0"/>
+            </w:pPr>
+            <w:r>
+              <w:rPr>
+                <w:rFonts w:ascii="Calibri" w:hAnsi="Calibri"/>
+                <w:color w:val="000000"/>
+                <w:sz w:val="19"/>
+              </w:rPr>
+              <w:t>persistence / clients</w:t>
+            </w:r>
+          </w:p>
+        </w:tc>
+        <w:tc>
+          <w:tcPr>
+            <w:tcW w:type="dxa" w:w="5060"/>
+            <w:tcMar>
+              <w:top w:w="80" w:type="dxa"/>
+              <w:start w:w="120" w:type="dxa"/>
+              <w:bottom w:w="80" w:type="dxa"/>
+              <w:end w:w="120" w:type="dxa"/>
+            </w:tcMar>
+            <w:vAlign w:val="center"/>
+          </w:tcPr>
+          <w:p>
+            <w:pPr>
+              <w:spacing w:after="0"/>
+            </w:pPr>
+            <w:r>
+              <w:rPr>
+                <w:rFonts w:ascii="Calibri" w:hAnsi="Calibri"/>
+                <w:color w:val="000000"/>
+                <w:sz w:val="19"/>
+              </w:rPr>
+              <w:t>PostgreSQL, education platform API, and billing API</w:t>
+            </w:r>
+          </w:p>
+        </w:tc>
+      </w:tr>
+      <w:tr>
+        <w:tc>
+          <w:tcPr>
+            <w:tcW w:type="dxa" w:w="1700"/>
+            <w:tcMar>
+              <w:top w:w="80" w:type="dxa"/>
+              <w:start w:w="120" w:type="dxa"/>
+              <w:bottom w:w="80" w:type="dxa"/>
+              <w:end w:w="120" w:type="dxa"/>
+            </w:tcMar>
+            <w:vAlign w:val="center"/>
+          </w:tcPr>
+          <w:p>
+            <w:pPr>
+              <w:spacing w:after="0"/>
+            </w:pPr>
+            <w:r>
+              <w:rPr>
+                <w:rFonts w:ascii="Calibri" w:hAnsi="Calibri"/>
+                <w:color w:val="000000"/>
+                <w:sz w:val="19"/>
+              </w:rPr>
+              <w:t>Contract</w:t>
+            </w:r>
+          </w:p>
+        </w:tc>
+        <w:tc>
+          <w:tcPr>
+            <w:tcW w:type="dxa" w:w="2600"/>
+            <w:tcMar>
+              <w:top w:w="80" w:type="dxa"/>
+              <w:start w:w="120" w:type="dxa"/>
+              <w:bottom w:w="80" w:type="dxa"/>
+              <w:end w:w="120" w:type="dxa"/>
+            </w:tcMar>
+            <w:vAlign w:val="center"/>
+          </w:tcPr>
+          <w:p>
+            <w:pPr>
+              <w:spacing w:after="0"/>
+            </w:pPr>
+            <w:r>
+              <w:rPr>
+                <w:rFonts w:ascii="Calibri" w:hAnsi="Calibri"/>
+                <w:color w:val="000000"/>
+                <w:sz w:val="19"/>
+              </w:rPr>
+              <w:t>openapi / event schema</w:t>
+            </w:r>
+          </w:p>
+        </w:tc>
+        <w:tc>
+          <w:tcPr>
+            <w:tcW w:type="dxa" w:w="5060"/>
+            <w:tcMar>
+              <w:top w:w="80" w:type="dxa"/>
+              <w:start w:w="120" w:type="dxa"/>
+              <w:bottom w:w="80" w:type="dxa"/>
+              <w:end w:w="120" w:type="dxa"/>
+            </w:tcMar>
+            <w:vAlign w:val="center"/>
+          </w:tcPr>
+          <w:p>
+            <w:pPr>
+              <w:spacing w:after="0"/>
+            </w:pPr>
+            <w:r>
+              <w:rPr>
+                <w:rFonts w:ascii="Calibri" w:hAnsi="Calibri"/>
+                <w:color w:val="000000"/>
+                <w:sz w:val="19"/>
+              </w:rPr>
+              <w:t>Versioned cross-system interface and contract tests</w:t>
+            </w:r>
+          </w:p>
+        </w:tc>
+      </w:tr>
+    </w:tbl>
+    <w:p>
+      <w:pPr>
+        <w:spacing w:after="0"/>
+      </w:pPr>
+    </w:p>
+    <w:p>
+      <w:pPr>
+        <w:spacing w:before="80" w:after="160"/>
+        <w:ind w:left="115" w:right="115"/>
+        <w:shd w:fill="EAF5EE"/>
+        <w:pBdr>
+          <w:left w:val="single" w:sz="18" w:space="6" w:color="2E74B5"/>
+        </w:pBdr>
+      </w:pPr>
+      <w:r>
+        <w:rPr>
+          <w:rFonts w:ascii="Calibri" w:hAnsi="Calibri"/>
+          <w:b/>
+          <w:color w:val="172B4D"/>
+          <w:sz w:val="22"/>
+        </w:rPr>
+        <w:t xml:space="preserve">MVP rule: </w:t>
+      </w:r>
+      <w:r>
+        <w:rPr>
+          <w:rFonts w:ascii="Calibri" w:hAnsi="Calibri"/>
+          <w:color w:val="172B4D"/>
+          <w:sz w:val="22"/>
+        </w:rPr>
+        <w:t>Gunakan standard library atau dependency tipis. Message broker, service mesh, dan microservice decomposition menunggu bukti load atau ownership.</w:t>
+      </w:r>
+    </w:p>
+    <w:p>
+      <w:pPr>
+        <w:numPr>
+          <w:ilvl w:val="0"/>
+          <w:numId w:val="10"/>
+        </w:numPr>
+        <w:spacing w:after="160" w:line="280" w:lineRule="auto"/>
+      </w:pPr>
+      <w:r>
+        <w:rPr>
+          <w:rFonts w:ascii="Calibri" w:hAnsi="Calibri"/>
+          <w:color w:val="000000"/>
+          <w:sz w:val="22"/>
+        </w:rPr>
+        <w:t>Perubahan state CRM dan outbox event ditulis dalam satu PostgreSQL transaction.</w:t>
+      </w:r>
+    </w:p>
+    <w:p>
+      <w:pPr>
+        <w:numPr>
+          <w:ilvl w:val="0"/>
+          <w:numId w:val="10"/>
+        </w:numPr>
+        <w:spacing w:after="160" w:line="280" w:lineRule="auto"/>
+      </w:pPr>
+      <w:r>
+        <w:rPr>
+          <w:rFonts w:ascii="Calibri" w:hAnsi="Calibri"/>
+          <w:color w:val="000000"/>
+          <w:sz w:val="22"/>
+        </w:rPr>
+        <w:t>Network call ke platform atau billing tidak dilakukan di dalam database transaction.</w:t>
+      </w:r>
+    </w:p>
+    <w:p>
+      <w:pPr>
+        <w:numPr>
+          <w:ilvl w:val="0"/>
+          <w:numId w:val="10"/>
+        </w:numPr>
+        <w:spacing w:after="160" w:line="280" w:lineRule="auto"/>
+      </w:pPr>
+      <w:r>
+        <w:rPr>
+          <w:rFonts w:ascii="Calibri" w:hAnsi="Calibri"/>
+          <w:color w:val="000000"/>
+          <w:sz w:val="22"/>
+        </w:rPr>
+        <w:t>context.Context membawa deadline dan cancellation sampai query serta outbound call.</w:t>
+      </w:r>
+    </w:p>
+    <w:p>
+      <w:pPr>
+        <w:numPr>
+          <w:ilvl w:val="0"/>
+          <w:numId w:val="10"/>
+        </w:numPr>
+        <w:spacing w:after="160" w:line="280" w:lineRule="auto"/>
+      </w:pPr>
+      <w:r>
+        <w:rPr>
+          <w:rFonts w:ascii="Calibri" w:hAnsi="Calibri"/>
+          <w:color w:val="000000"/>
+          <w:sz w:val="22"/>
+        </w:rPr>
+        <w:t>Worker memakai bounded concurrency, idempotency, exponential backoff, dan graceful shutdown.</w:t>
       </w:r>
     </w:p>
     <w:p>
@@ -6224,6 +6878,58 @@
           </w:p>
         </w:tc>
       </w:tr>
+      <w:tr>
+        <w:tc>
+          <w:tcPr>
+            <w:tcW w:type="dxa" w:w="2600"/>
+            <w:tcMar>
+              <w:top w:w="80" w:type="dxa"/>
+              <w:start w:w="120" w:type="dxa"/>
+              <w:bottom w:w="80" w:type="dxa"/>
+              <w:end w:w="120" w:type="dxa"/>
+            </w:tcMar>
+            <w:vAlign w:val="center"/>
+          </w:tcPr>
+          <w:p>
+            <w:pPr>
+              <w:spacing w:after="0"/>
+            </w:pPr>
+            <w:r>
+              <w:rPr>
+                <w:rFonts w:ascii="Calibri" w:hAnsi="Calibri"/>
+                <w:color w:val="000000"/>
+                <w:sz w:val="19"/>
+              </w:rPr>
+              <w:t>Go runtime</w:t>
+            </w:r>
+          </w:p>
+        </w:tc>
+        <w:tc>
+          <w:tcPr>
+            <w:tcW w:type="dxa" w:w="6760"/>
+            <w:tcMar>
+              <w:top w:w="80" w:type="dxa"/>
+              <w:start w:w="120" w:type="dxa"/>
+              <w:bottom w:w="80" w:type="dxa"/>
+              <w:end w:w="120" w:type="dxa"/>
+            </w:tcMar>
+            <w:vAlign w:val="center"/>
+          </w:tcPr>
+          <w:p>
+            <w:pPr>
+              <w:spacing w:after="0"/>
+            </w:pPr>
+            <w:r>
+              <w:rPr>
+                <w:rFonts w:ascii="Calibri" w:hAnsi="Calibri"/>
+                <w:color w:val="000000"/>
+                <w:sz w:val="19"/>
+              </w:rPr>
+              <w:t>Context deadlines, bounded goroutines, graceful shutdown</w:t>
+            </w:r>
+          </w:p>
+        </w:tc>
+      </w:tr>
     </w:tbl>
     <w:p>
       <w:pPr>
@@ -6776,7 +7482,7 @@
                 <w:color w:val="000000"/>
                 <w:sz w:val="19"/>
               </w:rPr>
-              <w:t>0. Contract discovery</w:t>
+              <w:t>0. Contract + Go baseline</w:t>
             </w:r>
           </w:p>
         </w:tc>
@@ -6801,7 +7507,7 @@
                 <w:color w:val="000000"/>
                 <w:sz w:val="19"/>
               </w:rPr>
-              <w:t>Inventory existing API/events, glossary, ID strategy, voucher and commission policy</w:t>
+              <w:t>Inventory APIs/events; initialize Go module, cmd/internal layout, migrations, and CI</w:t>
             </w:r>
           </w:p>
         </w:tc>
@@ -7335,7 +8041,7 @@
           <w:color w:val="172B4D"/>
           <w:sz w:val="22"/>
         </w:rPr>
-        <w:t>Jalankan contract discovery bersama owner platform, billing, sales operations, dan finance sebelum memilih framework atau memecah service.</w:t>
+        <w:t>Jalankan contract discovery bersama owner platform, billing, sales operations, dan finance; lalu buat skeleton Go crm-api/crm-worker sebelum membangun fitur bisnis.</w:t>
       </w:r>
     </w:p>
     <w:sectPr>

</xml_diff>